<commit_message>
Deploying to gh-pages from @ Morrison-Lab/wai@e640bc9bdd4522176a1fe44e8c52748a8d0b3574 🚀
</commit_message>
<xml_diff>
--- a/index.docx
+++ b/index.docx
@@ -15,7 +15,7 @@
         <w:pStyle w:val="Date"/>
       </w:pPr>
       <w:r>
-        <w:t xml:space="preserve">Last modified: 2026-10-08 18:32:17 (PDT)</w:t>
+        <w:t xml:space="preserve">Last modified: 2026-10-11 00:50:44 (PDT)</w:t>
       </w:r>
     </w:p>
     <w:p>
@@ -847,7 +847,7 @@
       </w:r>
     </w:p>
     <w:bookmarkEnd w:id="28"/>
-    <w:bookmarkStart w:id="31" w:name="about-this-website"/>
+    <w:bookmarkStart w:id="32" w:name="about-this-website"/>
     <w:p>
       <w:pPr>
         <w:pStyle w:val="Heading2"/>
@@ -916,8 +916,74 @@
         <w:t xml:space="preserve">.</w:t>
       </w:r>
     </w:p>
-    <w:bookmarkEnd w:id="31"/>
-    <w:bookmarkStart w:id="32" w:name="building-the-website"/>
+    <w:p>
+      <w:pPr>
+        <w:pStyle w:val="BodyText"/>
+      </w:pPr>
+      <w:r>
+        <w:t xml:space="preserve">That template’s structure comes from the</w:t>
+      </w:r>
+      <w:r>
+        <w:t xml:space="preserve"> </w:t>
+      </w:r>
+      <w:hyperlink r:id="rId9">
+        <w:r>
+          <w:rPr>
+            <w:rStyle w:val="Hyperlink"/>
+          </w:rPr>
+          <w:t xml:space="preserve">UCD-SERG Lab Manual</w:t>
+        </w:r>
+      </w:hyperlink>
+      <w:r>
+        <w:t xml:space="preserve">,</w:t>
+      </w:r>
+      <w:r>
+        <w:t xml:space="preserve"> </w:t>
+      </w:r>
+      <w:r>
+        <w:t xml:space="preserve">which is in turn adapted from the</w:t>
+      </w:r>
+      <w:r>
+        <w:t xml:space="preserve"> </w:t>
+      </w:r>
+      <w:hyperlink r:id="rId31">
+        <w:r>
+          <w:rPr>
+            <w:rStyle w:val="Hyperlink"/>
+          </w:rPr>
+          <w:t xml:space="preserve">Benjamin-Chung Lab Manual</w:t>
+        </w:r>
+      </w:hyperlink>
+      <w:r>
+        <w:t xml:space="preserve">.</w:t>
+      </w:r>
+      <w:r>
+        <w:t xml:space="preserve"> </w:t>
+      </w:r>
+      <w:r>
+        <w:t xml:space="preserve">This site’s own content also began as</w:t>
+      </w:r>
+      <w:r>
+        <w:t xml:space="preserve"> </w:t>
+      </w:r>
+      <w:r>
+        <w:t xml:space="preserve">the</w:t>
+      </w:r>
+      <w:r>
+        <w:t xml:space="preserve"> </w:t>
+      </w:r>
+      <w:r>
+        <w:t xml:space="preserve">“Working with AI”</w:t>
+      </w:r>
+      <w:r>
+        <w:t xml:space="preserve"> </w:t>
+      </w:r>
+      <w:r>
+        <w:t xml:space="preserve">chapter of the UCD-SERG Lab Manual.</w:t>
+      </w:r>
+    </w:p>
+    <w:bookmarkEnd w:id="32"/>
+    <w:bookmarkStart w:id="33" w:name="building-the-website"/>
     <w:p>
       <w:pPr>
         <w:pStyle w:val="Heading2"/>
@@ -999,8 +1065,8 @@
         <w:t xml:space="preserve">directory, which is published to GitHub Pages.</w:t>
       </w:r>
     </w:p>
-    <w:bookmarkEnd w:id="32"/>
-    <w:bookmarkStart w:id="34" w:name="license"/>
+    <w:bookmarkEnd w:id="33"/>
+    <w:bookmarkStart w:id="35" w:name="license"/>
     <w:p>
       <w:pPr>
         <w:pStyle w:val="Heading2"/>
@@ -1019,7 +1085,7 @@
       <w:r>
         <w:t xml:space="preserve"> </w:t>
       </w:r>
-      <w:hyperlink r:id="rId33">
+      <w:hyperlink r:id="rId34">
         <w:r>
           <w:rPr>
             <w:rStyle w:val="VerbatimChar"/>
@@ -1031,8 +1097,8 @@
         <w:t xml:space="preserve">.</w:t>
       </w:r>
     </w:p>
-    <w:bookmarkEnd w:id="34"/>
-    <w:bookmarkStart w:id="36" w:name="references"/>
+    <w:bookmarkEnd w:id="35"/>
+    <w:bookmarkStart w:id="37" w:name="references"/>
     <w:p>
       <w:pPr>
         <w:pStyle w:val="Heading2"/>
@@ -1041,9 +1107,9 @@
         <w:t xml:space="preserve">References</w:t>
       </w:r>
     </w:p>
-    <w:bookmarkStart w:id="35" w:name="refs"/>
-    <w:bookmarkEnd w:id="35"/>
+    <w:bookmarkStart w:id="36" w:name="refs"/>
     <w:bookmarkEnd w:id="36"/>
+    <w:bookmarkEnd w:id="37"/>
     <w:sectPr>
       <w:footnotePr>
         <w:numRestart w:val="eachSect"/>

</xml_diff>